<commit_message>
Reframe Stord: sole developer who built the first platform
The old bullets read as maintenance ("maintained the Ruby codebase")
when the actual work was building the first production platform as the
company's only developer. Stord has since raised $777M and reached a
$3B valuation, which is the context that makes early work land.

- Lead with what was built, not what was maintained
- State that he was the only developer, and Stord's current scale
- Frame the WMS integrations as the layer that made a network of
  independent warehouse operators work as one
- Keep CI, error alerting, and Elasticsearch, but as foundations laid
  for a team rather than a list of tasks

Applied to all three artifacts and asserted in check_resume_sync.py, so
the page, PDF, and .docx cannot drift apart on this.
</commit_message>
<xml_diff>
--- a/JeremiahParrackResume-2026.docx
+++ b/JeremiahParrackResume-2026.docx
@@ -744,7 +744,7 @@
           <w:color w:val="1A1A1A"/>
           <w:sz w:val="21"/>
         </w:rPr>
-        <w:t xml:space="preserve">  ·  STORD</w:t>
+        <w:t xml:space="preserve">  ·  Stord</w:t>
       </w:r>
       <w:r>
         <w:rPr>
@@ -770,7 +770,7 @@
           <w:color w:val="555555"/>
           <w:sz w:val="17"/>
         </w:rPr>
-        <w:t>Warehousing and distribution network with custom software for multi-warehouse product flow.</w:t>
+        <w:t>Seed-stage logistics startup where I was the only developer. Stord has since raised $777M and reached a $3B valuation.</w:t>
       </w:r>
     </w:p>
     <w:p>
@@ -782,12 +782,22 @@
       <w:r>
         <w:rPr>
           <w:rFonts w:ascii="Calibri" w:hAnsi="Calibri"/>
+          <w:b/>
+          <w:i w:val="0"/>
+          <w:color w:val="1A1A1A"/>
+          <w:sz w:val="19"/>
+        </w:rPr>
+        <w:t xml:space="preserve">Built the first production platform: </w:t>
+      </w:r>
+      <w:r>
+        <w:rPr>
+          <w:rFonts w:ascii="Calibri" w:hAnsi="Calibri"/>
           <w:b w:val="0"/>
           <w:i w:val="0"/>
           <w:color w:val="1A1A1A"/>
           <w:sz w:val="19"/>
         </w:rPr>
-        <w:t>built SOAP and REST integrations against third-party warehouse management systems to push and pull inventory data.</w:t>
+        <w:t>the Ruby application and data model behind multi-warehouse inventory and product flow, letting brands see and move stock across every warehouse from one dashboard — including a ground-up redesign of the database it all sat on.</w:t>
       </w:r>
     </w:p>
     <w:p>
@@ -799,12 +809,22 @@
       <w:r>
         <w:rPr>
           <w:rFonts w:ascii="Calibri" w:hAnsi="Calibri"/>
+          <w:b/>
+          <w:i w:val="0"/>
+          <w:color w:val="1A1A1A"/>
+          <w:sz w:val="19"/>
+        </w:rPr>
+        <w:t xml:space="preserve">Owned the integration layer: </w:t>
+      </w:r>
+      <w:r>
+        <w:rPr>
+          <w:rFonts w:ascii="Calibri" w:hAnsi="Calibri"/>
           <w:b w:val="0"/>
           <w:i w:val="0"/>
           <w:color w:val="1A1A1A"/>
           <w:sz w:val="19"/>
         </w:rPr>
-        <w:t>maintained the Ruby codebase through upgrades, patches, releases, and database migrations; played a key role in a database redesign.</w:t>
+        <w:t>connected third-party warehouse management systems over SOAP and REST so inventory synced automatically between Stord and partner warehouses, which is what made a network of independent operators work as one.</w:t>
       </w:r>
     </w:p>
     <w:p>
@@ -816,12 +836,22 @@
       <w:r>
         <w:rPr>
           <w:rFonts w:ascii="Calibri" w:hAnsi="Calibri"/>
+          <w:b/>
+          <w:i w:val="0"/>
+          <w:color w:val="1A1A1A"/>
+          <w:sz w:val="19"/>
+        </w:rPr>
+        <w:t xml:space="preserve">Laid the engineering foundations: </w:t>
+      </w:r>
+      <w:r>
+        <w:rPr>
+          <w:rFonts w:ascii="Calibri" w:hAnsi="Calibri"/>
           <w:b w:val="0"/>
           <w:i w:val="0"/>
           <w:color w:val="1A1A1A"/>
           <w:sz w:val="19"/>
         </w:rPr>
-        <w:t>introduced continuous integration, automated error notification for the development team, and Elasticsearch; oversaw unit and functional testing, debugging, security, and documentation.</w:t>
+        <w:t>introduced continuous integration, automated error alerting, and Elasticsearch, and set the unit and functional testing, debugging, security, and documentation practices the team scaled on.</w:t>
       </w:r>
     </w:p>
     <w:p>

</xml_diff>

<commit_message>
Add DoubleShot and speckit-skills to the resume docx
New "Tooling & desktop" group under Open Source, and Swift on the
Languages line.

DoubleShot leads with the signing and notarization rather than the
feature list — that is the part that reads as release engineering rather
than a weekend repo. speckit-skills leads with the checker resolving
requirements to tests, which is the idea worth showing.

Patched in place by cloning the existing group-heading and bullet
paragraph XML, since the generator was removed when the Google Doc
became the resume of record. That Doc still needs the same two entries
added by hand.
</commit_message>
<xml_diff>
--- a/JeremiahParrackResume-2026.docx
+++ b/JeremiahParrackResume-2026.docx
@@ -1126,6 +1126,77 @@
     </w:p>
     <w:p>
       <w:pPr>
+        <w:spacing w:before="120" w:after="60"/>
+      </w:pPr>
+      <w:r>
+        <w:rPr>
+          <w:rFonts w:ascii="Calibri" w:hAnsi="Calibri"/>
+          <w:b/>
+          <w:i w:val="0"/>
+          <w:caps/>
+          <w:color w:val="555555"/>
+          <w:sz w:val="18"/>
+          <w:spacing w:val="16"/>
+        </w:rPr>
+        <w:t>Tooling &amp; desktop</w:t>
+      </w:r>
+    </w:p>
+    <w:p>
+      <w:pPr>
+        <w:pStyle w:val="ListBullet"/>
+        <w:spacing w:after="30" w:line="254" w:lineRule="auto"/>
+        <w:ind w:left="259" w:hanging="187"/>
+      </w:pPr>
+      <w:r>
+        <w:rPr>
+          <w:rFonts w:ascii="Calibri" w:hAnsi="Calibri"/>
+          <w:b/>
+          <w:i w:val="0"/>
+          <w:color w:val="1A1A1A"/>
+          <w:sz w:val="19"/>
+        </w:rPr>
+        <w:t xml:space="preserve">DoubleShot:  </w:t>
+      </w:r>
+      <w:r>
+        <w:rPr>
+          <w:rFonts w:ascii="Calibri" w:hAnsi="Calibri"/>
+          <w:b w:val="0"/>
+          <w:i w:val="0"/>
+          <w:color w:val="1A1A1A"/>
+          <w:sz w:val="19"/>
+        </w:rPr>
+        <w:t>macOS menu bar app in Swift that tracks Claude Code spend and holds the machine awake mid-run. Signed with a Developer ID certificate, notarized by Apple, and distributed as a DMG.</w:t>
+      </w:r>
+    </w:p>
+    <w:p>
+      <w:pPr>
+        <w:pStyle w:val="ListBullet"/>
+        <w:spacing w:after="30" w:line="254" w:lineRule="auto"/>
+        <w:ind w:left="259" w:hanging="187"/>
+      </w:pPr>
+      <w:r>
+        <w:rPr>
+          <w:rFonts w:ascii="Calibri" w:hAnsi="Calibri"/>
+          <w:b/>
+          <w:i w:val="0"/>
+          <w:color w:val="1A1A1A"/>
+          <w:sz w:val="19"/>
+        </w:rPr>
+        <w:t xml:space="preserve">speckit-skills:  </w:t>
+      </w:r>
+      <w:r>
+        <w:rPr>
+          <w:rFonts w:ascii="Calibri" w:hAnsi="Calibri"/>
+          <w:b w:val="0"/>
+          <w:i w:val="0"/>
+          <w:color w:val="1A1A1A"/>
+          <w:sz w:val="19"/>
+        </w:rPr>
+        <w:t>spec-driven development plugin for Claude Code — the spec-kit loop across seven stack profiles, with a checker that resolves every requirement to the test that proves it.</w:t>
+      </w:r>
+    </w:p>
+    <w:p>
+      <w:pPr>
         <w:spacing w:before="220" w:after="100"/>
         <w:pBdr>
           <w:bottom w:val="single" w:sz="6" w:space="2" w:color="C8C8C8"/>
@@ -1166,7 +1237,7 @@
           <w:color w:val="1A1A1A"/>
           <w:sz w:val="18"/>
         </w:rPr>
-        <w:t>Ruby, Dart, TypeScript, JavaScript, Python, Rust, SQL, Bash</w:t>
+        <w:t>Ruby, Dart, Swift, TypeScript, JavaScript, Python, Rust, SQL, Bash</w:t>
       </w:r>
     </w:p>
     <w:p>

</xml_diff>